<commit_message>
Align TPI report with verified results
</commit_message>
<xml_diff>
--- a/TPI_1_Bases_de_datos_especializadas.docx
+++ b/TPI_1_Bases_de_datos_especializadas.docx
@@ -184,15 +184,8 @@
             </w:tcBorders>
           </w:tcPr>
           <w:p>
-            <w:pPr>
-              <w:spacing w:before="0" w:after="0" w:line="240" w:lineRule="auto"/>
-            </w:pPr>
             <w:r>
-              <w:rPr>
-                <w:rFonts w:ascii="Liberation Serif" w:hAnsi="Liberation Serif" w:eastAsia="Liberation Serif" w:cs="Liberation Serif"/>
-                <w:sz w:val="19"/>
-              </w:rPr>
-              <w:t>Nombre y apellidos del estudiante: ______________________________</w:t>
+              <w:t>Miguel Garcia Galan</w:t>
             </w:r>
           </w:p>
         </w:tc>
@@ -1063,7 +1056,7 @@
         <w:widowControl w:val="1"/>
       </w:pPr>
       <w:r>
-        <w:t>El Ayuntamiento de Madrid recibe avisos sobre incidencias de limpieza, arbolado, señales y otros servicios urbanos. El conjunto abierto Avisos ciudadanos recibidos (SIC) publica registros con fecha, categoría, distrito, dirección y coordenadas. Una unidad municipal necesita detectar avisos cercanos para apoyar el triaje y conocer cómo cambia el volumen por zona y categoría. Este trabajo desarrolla un proyecto reproducible con PostGIS para el análisis geográfico e InfluxDB para los agregados temporales. La memoria presenta una muestra real de cinco avisos de 2026; el repositorio deja preparado el flujo para procesar un CSV más amplio.</w:t>
+        <w:t>El Ayuntamiento de Madrid recibe avisos sobre incidencias de limpieza, arbolado, señales y otros servicios urbanos. El conjunto abierto Avisos ciudadanos recibidos (SIC) publica registros con fecha, categoría, distrito, dirección y coordenadas [1, 2]. Una unidad municipal necesita detectar avisos cercanos para apoyar el triaje y conocer cómo cambia el volumen por zona y categoría. Este trabajo desarrolla un proyecto reproducible con PostGIS para el análisis geográfico e InfluxDB para los agregados temporales. La memoria presenta una muestra real de cinco avisos de 2026; el repositorio deja preparado el flujo para procesar un CSV más amplio.</w:t>
       </w:r>
     </w:p>
     <w:p>
@@ -1123,7 +1116,7 @@
         <w:ind w:left="369" w:hanging="142"/>
       </w:pPr>
       <w:r>
-        <w:t>Tomar una muestra reproducible del conjunto municipal y conservar la atribución y el sistema de referencia de las coordenadas.</w:t>
+        <w:t>Tomar una muestra reproducible del conjunto municipal, conservar la atribución y el sistema de referencia de las coordenadas, y validar el flujo en PostGIS e InfluxDB.</w:t>
       </w:r>
     </w:p>
     <w:p>
@@ -1173,7 +1166,7 @@
         <w:widowControl w:val="1"/>
       </w:pPr>
       <w:r>
-        <w:t>Cada aviso se representa como geometry(Point, 25830), ya que el diccionario municipal describe sus coordenadas reales en UTM-30 ETRS89. En esa proyección, las distancias se expresan en metros dentro del ámbito de Madrid. La tabla conserva identificador, fecha, categorías y dirección, además de la geometría.</w:t>
+        <w:t>Cada aviso se representa como geometry(Point, 25830), ya que el diccionario municipal describe sus coordenadas reales en UTM-30 ETRS89. En esa proyección, las distancias se expresan en metros dentro del ámbito de Madrid [3]. La tabla conserva identificador, fecha, categorías y dirección, además de la geometría.</w:t>
       </w:r>
     </w:p>
     <w:p>
@@ -1190,7 +1183,7 @@
         <w:widowControl w:val="1"/>
       </w:pPr>
       <w:r>
-        <w:t>En PostGIS, ST_DWithin selecciona pares de puntos a 50 metros o menos y un índice GiST puede reducir los candidatos. La consulta excluye el mismo aviso y evita duplicados ordenando los identificadores. InfluxDB cubre la pregunta temporal: almacena el total diario como campo y distrito y categoría como etiquetas. El identificador individual no se usa como etiqueta para evitar cardinalidad innecesaria.</w:t>
+        <w:t>En PostGIS, ST_DWithin selecciona pares de puntos a 50 metros o menos y un índice GiST puede reducir los candidatos [4]. La consulta excluye el mismo aviso y evita duplicados ordenando los identificadores. InfluxDB cubre la pregunta temporal: almacena el total diario como campo y distrito y categoría como etiquetas [5]. El identificador individual no se usa como etiqueta para evitar cardinalidad innecesaria.</w:t>
       </w:r>
     </w:p>
     <w:p>
@@ -1254,7 +1247,7 @@
         <w:widowControl w:val="1"/>
       </w:pPr>
       <w:r>
-        <w:t>En la muestra de cinco avisos, PostGIS y la prueba SQLite/R-tree encontraron el mismo único par a 50 m o menos: los avisos 2 y 4, del barrio Media Legua, calle Corregidor Diego de Valderrabano, números 32 y 26. Pertenecen a categorías distintas y están separados por 21,0 m. InfluxDB recibió y devolvió cinco puntos diarios, uno por combinación de distrito y categoría, todos con total 1. Tras repetir la carga, ambos motores conservaron cinco registros/grupos sin duplicados.</w:t>
+        <w:t>En la muestra de cinco avisos, PostGIS y la prueba SQLite/R-tree encontraron el mismo único par a 50 m o menos: los avisos 2 y 4, del barrio Media Legua, calle Corregidor Diego de Valderrabano, números 32 y 26. Pertenecen a categorías distintas y están separados por 21,0 m. InfluxDB recibió cinco puntos con marca temporal de medianoche UTC del 1 de enero de 2026, uno por cada combinación de distrito y categoría. La consulta Flux devolvió cinco grupos, todos con total 1. La agregación diaria etiqueta cada resultado con el final de la ventana; por eso la interfaz muestra el 2 de enero a la 01:00 (hora local), aunque los puntos originales correspondan al 1 de enero. Tras repetir la carga, ambos motores conservaron cinco registros/grupos. Como todos los avisos comparten fecha, la muestra valida la escritura y consulta, pero no permite evaluar tendencias temporales.</w:t>
       </w:r>
     </w:p>
     <w:p>
@@ -1348,12 +1341,7 @@
         <w:widowControl w:val="1"/>
       </w:pPr>
       <w:r>
-        <w:rPr>
-          <w:rFonts w:ascii="Liberation Serif" w:hAnsi="Liberation Serif" w:eastAsia="Liberation Serif" w:cs="Liberation Serif"/>
-          <w:b/>
-          <w:sz w:val="20"/>
-        </w:rPr>
-        <w:t>Declaración cumplimentada de acuerdo con el uso realizado en la elaboración de este borrador.</w:t>
+        <w:t>Se declara el apoyo de inteligencia artificial utilizado durante la elaboración de esta memoria.</w:t>
       </w:r>
     </w:p>
     <w:p>
@@ -1467,7 +1455,7 @@
         <w:widowControl w:val="1"/>
       </w:pPr>
       <w:r>
-        <w:t>Apoyo para estructurar y redactar la memoria, preparar el código del proyecto y aclarar el diseño de la carga espacial y temporal. El contenido debe revisarse y defenderse con comprensión propia antes de la entrega.</w:t>
+        <w:t>ChatGPT (OpenAI) se utilizó como apoyo para estructurar y redactar la memoria, preparar el código del proyecto y aclarar el diseño de la carga espacial y temporal.</w:t>
       </w:r>
     </w:p>
     <w:p>
@@ -1476,18 +1464,7 @@
         <w:widowControl w:val="1"/>
       </w:pPr>
       <w:r>
-        <w:rPr>
-          <w:rFonts w:ascii="Liberation Serif" w:hAnsi="Liberation Serif" w:eastAsia="Liberation Serif" w:cs="Liberation Serif"/>
-          <w:b/>
-          <w:sz w:val="20"/>
-        </w:rPr>
-        <w:t>Revisión y validación personal:</w:t>
-      </w:r>
-      <w:r>
-        <w:rPr>
-          <w:rFonts w:ascii="Liberation Serif" w:hAnsi="Liberation Serif" w:eastAsia="Liberation Serif" w:cs="Liberation Serif"/>
-          <w:sz w:val="20"/>
-        </w:rPr>
+        <w:t>Comprobaciones realizadas:</w:t>
       </w:r>
     </w:p>
     <w:p>
@@ -1496,7 +1473,7 @@
         <w:widowControl w:val="1"/>
       </w:pPr>
       <w:r>
-        <w:t>La distancia de 21,0 m se obtuvo con el prototipo SQLite/R-tree y se contrastó con la consulta PostGIS. La carga de cinco avisos y los cinco agregados de InfluxDB también se ejecutaron. El estudiante debe revisar el contenido y comprender los pasos y decisiones antes de entregar.</w:t>
+        <w:t>La carga con Docker, la consulta espacial de PostGIS y la consulta temporal de InfluxDB se ejecutaron con la muestra descrita. La distancia de 21,0 m se contrastó también con SQLite/R-tree; los resultados y las limitaciones de la muestra se explican en esta memoria.</w:t>
       </w:r>
     </w:p>
     <w:p>
@@ -1552,7 +1529,7 @@
         <w:widowControl w:val="1"/>
       </w:pPr>
       <w:r>
-        <w:t>Anexo A. Consulta PostGIS propuesta para repetir el análisis. Se usa un emparejamiento de identificadores sin duplicados y ST_DWithin para aplicar el umbral de 50 metros. Esta consulta está incluida en sql/nearby.sql y aún debe ejecutarse sobre los contenedores configurados.</w:t>
+        <w:t>Anexo A. Consulta PostGIS ejecutada. El emparejamiento ordena los identificadores para evitar pares repetidos y aplica ST_DWithin con un umbral de 50 metros. El archivo sql/nearby.sql devolvió el par de avisos 2 y 4, separados por 21,0 m.</w:t>
       </w:r>
     </w:p>
     <w:sectPr>

</xml_diff>